<commit_message>
docs: dong bo bao cao nop cuoi DT056
</commit_message>
<xml_diff>
--- a/docs/baocao-cuoi/N24DCDT065_DT056_NguyenNguNhut_BaoCao.docx
+++ b/docs/baocao-cuoi/N24DCDT065_DT056_NguyenNguNhut_BaoCao.docx
@@ -651,7 +651,7 @@
           <w:i w:val="0"/>
           <w:sz w:val="26"/>
         </w:rPr>
-        <w:t>Ví dụ 1: X = "CAT", Y = "CUT". Hai ký tự C, T giữ nguyên, chỉ cần thay ký tự giữa nên khoảng cách bằng 1.</w:t>
+        <w:t>Ví dụ 1: X = “CAT”, Y = “CUT”. Hai ký tự C, T giữ nguyên, chỉ cần thay ký tự giữa nên khoảng cách bằng 1.</w:t>
       </w:r>
     </w:p>
     <w:p>
@@ -667,7 +667,7 @@
           <w:i w:val="0"/>
           <w:sz w:val="26"/>
         </w:rPr>
-        <w:t>Ví dụ 2: X = "A", Y = "". Xâu đích rỗng nên xóa ký tự duy nhất của xâu nguồn, khoảng cách bằng 1.</w:t>
+        <w:t>Ví dụ 2: X = “A”, Y = “”. Xâu đích rỗng nên xóa ký tự duy nhất của xâu nguồn, khoảng cách bằng 1.</w:t>
       </w:r>
     </w:p>
     <w:p>
@@ -845,7 +845,7 @@
           <w:rFonts w:ascii="Times New Roman" w:hAnsi="Times New Roman"/>
           <w:sz w:val="26"/>
         </w:rPr>
-        <w:t>X = "", Y = "": khoảng cách 0, danh sách thao tác rỗng.</w:t>
+        <w:t>X = “”, Y = “”: khoảng cách 0, danh sách thao tác rỗng.</w:t>
       </w:r>
     </w:p>
     <w:p>
@@ -863,7 +863,7 @@
           <w:rFonts w:ascii="Times New Roman" w:hAnsi="Times New Roman"/>
           <w:sz w:val="26"/>
         </w:rPr>
-        <w:t>X = "", Y = "AB": khoảng cách 2 bằng hai lần chèn.</w:t>
+        <w:t>X = “”, Y = “AB”: khoảng cách 2 bằng hai lần chèn.</w:t>
       </w:r>
     </w:p>
     <w:p>
@@ -881,7 +881,7 @@
           <w:rFonts w:ascii="Times New Roman" w:hAnsi="Times New Roman"/>
           <w:sz w:val="26"/>
         </w:rPr>
-        <w:t>X = "ABC", Y = "ABC": khoảng cách 0, không thay ký tự giống nhau.</w:t>
+        <w:t>X = “ABC”, Y = “ABC”: khoảng cách 0, không thay ký tự giống nhau.</w:t>
       </w:r>
     </w:p>
     <w:p>
@@ -899,7 +899,7 @@
           <w:rFonts w:ascii="Times New Roman" w:hAnsi="Times New Roman"/>
           <w:sz w:val="26"/>
         </w:rPr>
-        <w:t>X = "AB", Y = "BA": khoảng cách 2, không được dùng đổi chỗ một lần.</w:t>
+        <w:t>X = “AB”, Y = “BA”: khoảng cách 2, không được dùng đổi chỗ một lần.</w:t>
       </w:r>
     </w:p>
     <w:p>
@@ -917,7 +917,7 @@
           <w:rFonts w:ascii="Times New Roman" w:hAnsi="Times New Roman"/>
           <w:sz w:val="26"/>
         </w:rPr>
-        <w:t>X = "ABC", Y = "AC": khoảng cách 1 bằng xóa B.</w:t>
+        <w:t>X = “ABC”, Y = “AC”: khoảng cách 1 bằng xóa B.</w:t>
       </w:r>
     </w:p>
     <w:p>
@@ -2167,7 +2167,7 @@
           <w:i w:val="0"/>
           <w:sz w:val="26"/>
         </w:rPr>
-        <w:t>Báo cáo trình bày bài toán khoảng cách chỉnh sửa giữa hai xâu: biến xâu X thành xâu Y bằng ít thao tác chèn, xóa, thay nhất, mỗi thao tác chi phí 1, giữ nguyên ký tự giống nhau không mất chi phí. Ngoài con số khoảng cách, bài làm còn phải sinh ra dãy thao tác cụ thể, thực hiện lại dãy đó và kiểm xâu cuối đúng bằng Y.</w:t>
+        <w:t>Nội dung báo cáo xoay quanh bài toán khoảng cách chỉnh sửa giữa hai xâu: biến X thành Y bằng ít thao tác chèn, xóa, thay nhất, mỗi thao tác tốn chi phí 1, còn ký tự giống nhau thì giữ nguyên và không mất chi phí. Ngoài con số khoảng cách, bài làm còn phải sinh ra dãy thao tác cụ thể, thực hiện lại dãy đó và kiểm xâu cuối đúng bằng Y.</w:t>
       </w:r>
     </w:p>
     <w:p>
@@ -2199,7 +2199,7 @@
           <w:i w:val="0"/>
           <w:sz w:val="26"/>
         </w:rPr>
-        <w:t>Chương trình viết bằng Julia 1.13.1, chỉ dùng thư viện chuẩn, gồm ba hàm bắt buộc theo phiếu và hai hàm hỗ trợ kiểm tra dữ liệu, in bảng. Bộ kiểm thử có 13 ca độc lập (hai ví dụ, năm ca phiếu, hai ca tự thiết kế, ba ca biên, một ca dữ liệu sai) và 400 cặp xâu ngẫu nhiên để kiểm bất biến; tổng 21.803 phép kiểm, tất cả đạt.</w:t>
+        <w:t>Mã chạy trên Julia 1.13.1, chỉ dùng thư viện chuẩn, gồm ba hàm bắt buộc theo phiếu cùng hai hàm hỗ trợ việc kiểm dữ liệu và in bảng. Bộ kiểm thử có 13 ca độc lập (hai ví dụ, năm ca phiếu, hai ca tự thiết kế, ba ca biên, một ca dữ liệu sai) và 400 cặp xâu ngẫu nhiên để kiểm bất biến; tổng 21.803 phép kiểm, tất cả đạt.</w:t>
       </w:r>
     </w:p>
     <w:p>
@@ -2215,7 +2215,7 @@
           <w:i w:val="0"/>
           <w:sz w:val="26"/>
         </w:rPr>
-        <w:t>Kết quả đo trên ba quy mô m = n = 10, 20, 30 cho thấy số ô bảng tăng đúng theo (m+1)(n+1), thời gian tăng theo số ô, phù hợp với phân tích O(mn). Báo cáo cũng nêu giới hạn của bản cài (chi phí đơn vị, không có đổi chỗ, bộ nhớ O(mn) do phải giữ bảng để truy vết) và hướng phát triển tiếp theo.</w:t>
+        <w:t>Số liệu đo ở ba quy mô m = n = 10, 20, 30 cho thấy số ô bảng tăng đúng theo (m+1)(n+1) và thời gian tăng theo số ô, khớp với phân tích O(mn). Báo cáo cũng nêu giới hạn của bản cài (chi phí đơn vị, không có đổi chỗ, bộ nhớ O(mn) do phải giữ bảng để truy vết) và hướng phát triển tiếp theo.</w:t>
       </w:r>
     </w:p>
     <w:p>
@@ -4125,7 +4125,7 @@
           <w:sz w:val="24"/>
         </w:rPr>
         <w:tab/>
-        <w:t>31</w:t>
+        <w:t>32</w:t>
       </w:r>
     </w:p>
     <w:p>
@@ -4729,7 +4729,7 @@
           <w:i w:val="0"/>
           <w:sz w:val="26"/>
         </w:rPr>
-        <w:t>Đầu vào là hai xâu ký tự, mỗi xâu dài từ 0 đến 30, chỉ chứa chữ cái Latin không dấu. Ký tự hoa và thường được coi là khác nhau, nên "Cat" và "CAT" có khoảng cách bằng 2 dù nhìn giống nhau. Xâu rỗng hợp lệ và được nhập bằng cách bấm Enter.</w:t>
+        <w:t>Đầu vào là hai xâu ký tự, mỗi xâu dài từ 0 đến 30, chỉ chứa chữ cái Latin không dấu. Ký tự hoa và thường được coi là khác nhau, nên “Cat” và “CAT” có khoảng cách bằng 2 dù nhìn giống nhau. Xâu rỗng hợp lệ và được nhập bằng cách bấm Enter.</w:t>
       </w:r>
     </w:p>
     <w:p>
@@ -5681,7 +5681,7 @@
           <w:i w:val="0"/>
           <w:sz w:val="26"/>
         </w:rPr>
-        <w:t>Bài làm đi theo bốn bước: đọc phiếu và giáo trình, làm tay một ví dụ nhỏ, cài đặt rồi kiểm thử, cuối cùng là chạy thật để lấy số liệu và ảnh. Bước làm tay quan trọng vì nó cho biết bảng phải trông như thế nào trước khi viết mã; nếu bỏ qua, rất dễ viết đúng công thức nhưng sai chiều chỉ số.</w:t>
+        <w:t>Các bước thực hiện khá gọn: đọc phiếu và giáo trình, làm tay một ví dụ nhỏ, cài đặt rồi kiểm thử, cuối cùng chạy thật để lấy số liệu và ảnh. Bước làm tay quan trọng vì nó cho biết bảng phải trông ra sao trước khi viết mã; bỏ qua bước này rất dễ viết đúng công thức nhưng sai chiều chỉ số.</w:t>
       </w:r>
     </w:p>
     <w:p>
@@ -7747,7 +7747,7 @@
           <w:i w:val="0"/>
           <w:sz w:val="26"/>
         </w:rPr>
-        <w:t>Ví dụ, nhập Y = "A1" sẽ nhận thông báo: Y có ký tự không hợp lệ '1' tại vị trí 2 (chỉ nhận A–Z, a–z). Chương trình dừng trước khi gọi thuật toán, nên không có trường hợp tính ra kết quả từ dữ liệu sai.</w:t>
+        <w:t>Ví dụ, nhập Y = “A1” sẽ nhận thông báo: Y có ký tự không hợp lệ '1' tại vị trí 2 (chỉ nhận A–Z, a–z). Chương trình dừng trước khi gọi thuật toán, nên không có trường hợp tính ra kết quả từ dữ liệu sai.</w:t>
       </w:r>
     </w:p>
     <w:p>
@@ -9005,7 +9005,7 @@
           <w:i w:val="0"/>
           <w:sz w:val="26"/>
         </w:rPr>
-        <w:t>Ca truy vết thứ nhất là ví dụ 1 của phiếu: X = "CAT", Y = "CUT". Bảng f có kích thước 4 × 4, hàng và cột 0 là điều kiện biên.</w:t>
+        <w:t>Lần vết đầu tiên lấy đúng ví dụ 1 của phiếu, X = “CAT” và Y = “CUT”. Bảng f có kích thước 4 × 4, với hàng 0 và cột 0 là điều kiện biên.</w:t>
       </w:r>
     </w:p>
     <w:p>
@@ -9801,7 +9801,7 @@
           <w:i w:val="0"/>
           <w:sz w:val="26"/>
         </w:rPr>
-        <w:t>Ca thứ hai dài hơn để thấy cả ba loại thao tác: X = "SUNDAY", Y = "SATURDAY". Khoảng cách bằng 3, gồm hai lần chèn và một lần thay.</w:t>
+        <w:t>Lần vết thứ hai dài hơn để thấy đủ ba loại thao tác, X = “SUNDAY” và Y = “SATURDAY”. Khoảng cách bằng 3, gồm hai lần chèn và một lần thay.</w:t>
       </w:r>
     </w:p>
     <w:p>
@@ -14490,7 +14490,7 @@
           <w:i w:val="0"/>
           <w:sz w:val="26"/>
         </w:rPr>
-        <w:t>Hình 4.1 là màn hình VS Code khi chạy lệnh julia main.jl vd1. Bảng f in ra khớp với bảng tính tay ở mục 3.4, ô cuối bằng 1, dãy thao tác chỉ có một lần thay và dòng kiểm lại xác nhận xâu cuối bằng Y.</w:t>
+        <w:t>Ảnh A01 ghi lại màn hình VS Code ở lần chạy julia main.jl vd1. Bảng f in ra khớp với bảng tính tay ở mục 3.4, ô cuối bằng 1, dãy thao tác chỉ có một lần thay và dòng kiểm lại xác nhận xâu cuối bằng Y.</w:t>
       </w:r>
     </w:p>
     <w:p>
@@ -14561,7 +14561,7 @@
           <w:i w:val="0"/>
           <w:sz w:val="26"/>
         </w:rPr>
-        <w:t>Điểm đáng chú ý là dòng "Kiểm lại: xâu cuối BẰNG Y". Dòng này do chính chương trình sinh ra sau khi áp dụng dãy thao tác, không phải câu ghi tay, nên nếu thuật toán sai thì ảnh sẽ thể hiện ngay.</w:t>
+        <w:t>Điểm đáng chú ý là dòng “Kiểm lại: xâu cuối BẰNG Y”. Dòng này do chính chương trình sinh ra sau khi áp dụng dãy thao tác, không phải câu ghi tay, nên nếu thuật toán sai thì ảnh sẽ thể hiện ngay.</w:t>
       </w:r>
     </w:p>
     <w:p>
@@ -14577,7 +14577,7 @@
           <w:i w:val="0"/>
           <w:sz w:val="26"/>
         </w:rPr>
-        <w:t>Hình 4.2 là ví dụ 2 với xâu đích rỗng. Bảng chỉ còn một cột, hàm truy vết đi theo nhánh xóa đến khi hết xâu. Kết quả khoảng cách 1 và xâu cuối rỗng, đúng kỳ vọng.</w:t>
+        <w:t>Ảnh A02 là ví dụ 2 với xâu đích rỗng. Bảng chỉ còn một cột, hàm truy vết đi theo nhánh xóa đến khi hết xâu. Kết quả khoảng cách 1 và xâu cuối rỗng, đúng kỳ vọng.</w:t>
       </w:r>
     </w:p>
     <w:p>
@@ -14672,7 +14672,7 @@
           <w:i w:val="0"/>
           <w:sz w:val="26"/>
         </w:rPr>
-        <w:t>Ca TK01 dùng X = "SUNDAY", Y = "SATURDAY", khoảng cách tính tay bằng 3 vì phải chèn A, chèn T và thay N thành R. Kết quả chạy cho đúng 3 bước theo thứ tự đó, xâu cuối bằng SATURDAY. Ca này kiểm nhánh chèn liên tiếp, khác với ví dụ 1 chỉ có thay.</w:t>
+        <w:t>TK01 lấy X = “SUNDAY” và Y = “SATURDAY”; khoảng cách tính tay bằng 3 vì phải chèn A, chèn T rồi thay N thành R. Kết quả chạy cho đúng 3 bước theo thứ tự đó, xâu cuối bằng SATURDAY. Ca này kiểm nhánh chèn liên tiếp, khác với ví dụ 1 chỉ có thay.</w:t>
       </w:r>
     </w:p>
     <w:p>
@@ -14688,7 +14688,7 @@
           <w:i w:val="0"/>
           <w:sz w:val="26"/>
         </w:rPr>
-        <w:t>Ca TK02 dùng X = "kitten", Y = "sitting", khoảng cách 3 gồm thay k thành s, thay e thành i và chèn g ở cuối. Ca này kiểm chữ thường và kiểm trường hợp ba loại thao tác cùng xuất hiện trong một dãy. Cả hai ca đều đạt và dãy thao tác áp dụng lại cho đúng xâu đích.</w:t>
+        <w:t>TK02 lấy X = “kitten” và Y = “sitting”; khoảng cách 3 gồm thay k thành s, thay e thành i và chèn g ở cuối. Ca này kiểm chữ thường và kiểm trường hợp ba loại thao tác cùng xuất hiện trong một dãy. Cả hai ca đều đạt và dãy thao tác áp dụng lại cho đúng xâu đích.</w:t>
       </w:r>
     </w:p>
     <w:p>
@@ -15171,7 +15171,7 @@
           <w:i w:val="0"/>
           <w:sz w:val="26"/>
         </w:rPr>
-        <w:t>Về phía chấp nhận, điều kiện là "không quá 30" chứ không phải "nhỏ hơn 30": hai xâu dài đúng 30 vẫn hợp lệ, và ca B02 ở mục 4.5 đã dùng đúng biên này.</w:t>
+        <w:t>Về phía chấp nhận, điều kiện là “không quá 30” chứ không phải “nhỏ hơn 30”: hai xâu dài đúng 30 vẫn hợp lệ, và ca B02 ở mục 4.5 đã dùng đúng biên này.</w:t>
       </w:r>
     </w:p>
     <w:p>
@@ -15860,7 +15860,7 @@
           <w:i w:val="0"/>
           <w:sz w:val="26"/>
         </w:rPr>
-        <w:t>Mã nguồn được lưu trong kho GitHub công khai ở địa chỉ dưới đây. Kho đã nhận bản nộp: nhánh main ở commit b77199d, và commit này chỉ thêm mười ảnh minh chứng so với commit fcb4d2e, không sửa mã nguồn, bộ kiểm thử hay dữ liệu vào. Hai đường dẫn tới src/DeTai.jl và test/kiem_thu.jl tại commit đã cho mở được bằng trình duyệt ẩn danh.</w:t>
+        <w:t>Mã nguồn được lưu trong kho GitHub công khai ở địa chỉ dưới đây. Bản nộp nằm ở commit b77199d; so với commit fcb4d2e, commit này chỉ thêm mười ảnh minh chứng, không sửa mã nguồn, bộ kiểm thử hay dữ liệu vào. Sau đó nhánh main có thêm các commit cập nhật tài liệu, không đổi mã nguồn. Hai đường dẫn tới src/DeTai.jl và test/kiem_thu.jl tại commit đã cho mở được bằng trình duyệt ẩn danh.</w:t>
       </w:r>
     </w:p>
     <w:p>
@@ -16016,7 +16016,7 @@
                 <w:rFonts w:ascii="Times New Roman" w:hAnsi="Times New Roman"/>
                 <w:sz w:val="21"/>
               </w:rPr>
-              <w:t>công khai, nhánh main có 2 commit</w:t>
+              <w:t>công khai; bản nộp ở commit b77199d, sau đó có thêm commit tài liệu</w:t>
             </w:r>
           </w:p>
         </w:tc>
@@ -17000,7 +17000,7 @@
                 <w:rFonts w:ascii="Times New Roman" w:hAnsi="Times New Roman"/>
                 <w:sz w:val="22"/>
               </w:rPr>
-              <w:t>mục 4.9, kho công khai, 2 commit</w:t>
+              <w:t>mục 4.9, kho công khai, commit b77199d</w:t>
             </w:r>
           </w:p>
         </w:tc>

</xml_diff>